<commit_message>
Actualización de la documentación del proyecto
</commit_message>
<xml_diff>
--- a/SEMANA 3.docx
+++ b/SEMANA 3.docx
@@ -3032,6 +3032,372 @@
           <w:szCs w:val="24"/>
         </w:rPr>
       </w:pPr>
+    </w:p>
+    <w:p>
+      <w:pPr>
+        <w:spacing w:after="0" w:line="360" w:lineRule="auto"/>
+        <w:rPr>
+          <w:rFonts w:ascii="Times New Roman" w:hAnsi="Times New Roman" w:cs="Times New Roman"/>
+          <w:noProof/>
+          <w:sz w:val="24"/>
+          <w:szCs w:val="24"/>
+        </w:rPr>
+      </w:pPr>
+    </w:p>
+    <w:p>
+      <w:pPr>
+        <w:spacing w:after="0" w:line="360" w:lineRule="auto"/>
+        <w:rPr>
+          <w:rFonts w:ascii="Times New Roman" w:hAnsi="Times New Roman" w:cs="Times New Roman"/>
+          <w:noProof/>
+          <w:sz w:val="24"/>
+          <w:szCs w:val="24"/>
+        </w:rPr>
+      </w:pPr>
+    </w:p>
+    <w:p>
+      <w:pPr>
+        <w:spacing w:after="0" w:line="360" w:lineRule="auto"/>
+        <w:rPr>
+          <w:rFonts w:ascii="Times New Roman" w:hAnsi="Times New Roman" w:cs="Times New Roman"/>
+          <w:noProof/>
+          <w:sz w:val="24"/>
+          <w:szCs w:val="24"/>
+        </w:rPr>
+      </w:pPr>
+    </w:p>
+    <w:p>
+      <w:pPr>
+        <w:spacing w:after="0" w:line="360" w:lineRule="auto"/>
+        <w:rPr>
+          <w:rFonts w:ascii="Times New Roman" w:hAnsi="Times New Roman" w:cs="Times New Roman"/>
+          <w:noProof/>
+          <w:sz w:val="24"/>
+          <w:szCs w:val="24"/>
+        </w:rPr>
+      </w:pPr>
+    </w:p>
+    <w:p>
+      <w:pPr>
+        <w:spacing w:after="0" w:line="360" w:lineRule="auto"/>
+        <w:rPr>
+          <w:rFonts w:ascii="Times New Roman" w:hAnsi="Times New Roman" w:cs="Times New Roman"/>
+          <w:noProof/>
+          <w:sz w:val="24"/>
+          <w:szCs w:val="24"/>
+        </w:rPr>
+      </w:pPr>
+    </w:p>
+    <w:p>
+      <w:pPr>
+        <w:spacing w:after="0" w:line="360" w:lineRule="auto"/>
+        <w:rPr>
+          <w:rFonts w:ascii="Times New Roman" w:hAnsi="Times New Roman" w:cs="Times New Roman"/>
+          <w:noProof/>
+          <w:sz w:val="24"/>
+          <w:szCs w:val="24"/>
+        </w:rPr>
+      </w:pPr>
+    </w:p>
+    <w:p>
+      <w:pPr>
+        <w:spacing w:after="0" w:line="360" w:lineRule="auto"/>
+        <w:rPr>
+          <w:rFonts w:ascii="Times New Roman" w:hAnsi="Times New Roman" w:cs="Times New Roman"/>
+          <w:noProof/>
+          <w:sz w:val="24"/>
+          <w:szCs w:val="24"/>
+        </w:rPr>
+      </w:pPr>
+    </w:p>
+    <w:p>
+      <w:pPr>
+        <w:spacing w:after="0" w:line="360" w:lineRule="auto"/>
+        <w:rPr>
+          <w:rFonts w:ascii="Times New Roman" w:hAnsi="Times New Roman" w:cs="Times New Roman"/>
+          <w:noProof/>
+          <w:sz w:val="24"/>
+          <w:szCs w:val="24"/>
+        </w:rPr>
+      </w:pPr>
+    </w:p>
+    <w:p>
+      <w:pPr>
+        <w:spacing w:after="0" w:line="360" w:lineRule="auto"/>
+        <w:rPr>
+          <w:rFonts w:ascii="Times New Roman" w:hAnsi="Times New Roman" w:cs="Times New Roman"/>
+          <w:noProof/>
+          <w:sz w:val="24"/>
+          <w:szCs w:val="24"/>
+        </w:rPr>
+      </w:pPr>
+    </w:p>
+    <w:p>
+      <w:pPr>
+        <w:spacing w:after="0" w:line="360" w:lineRule="auto"/>
+        <w:rPr>
+          <w:rFonts w:ascii="Times New Roman" w:hAnsi="Times New Roman" w:cs="Times New Roman"/>
+          <w:noProof/>
+          <w:sz w:val="24"/>
+          <w:szCs w:val="24"/>
+        </w:rPr>
+      </w:pPr>
+    </w:p>
+    <w:p>
+      <w:pPr>
+        <w:spacing w:after="0" w:line="360" w:lineRule="auto"/>
+        <w:rPr>
+          <w:rFonts w:ascii="Times New Roman" w:hAnsi="Times New Roman" w:cs="Times New Roman"/>
+          <w:noProof/>
+          <w:sz w:val="24"/>
+          <w:szCs w:val="24"/>
+        </w:rPr>
+      </w:pPr>
+    </w:p>
+    <w:p>
+      <w:pPr>
+        <w:spacing w:after="0" w:line="360" w:lineRule="auto"/>
+        <w:rPr>
+          <w:rFonts w:ascii="Times New Roman" w:hAnsi="Times New Roman" w:cs="Times New Roman"/>
+          <w:noProof/>
+          <w:sz w:val="24"/>
+          <w:szCs w:val="24"/>
+        </w:rPr>
+      </w:pPr>
+    </w:p>
+    <w:p>
+      <w:pPr>
+        <w:spacing w:after="0" w:line="360" w:lineRule="auto"/>
+        <w:rPr>
+          <w:rFonts w:ascii="Times New Roman" w:hAnsi="Times New Roman" w:cs="Times New Roman"/>
+          <w:noProof/>
+          <w:sz w:val="24"/>
+          <w:szCs w:val="24"/>
+        </w:rPr>
+      </w:pPr>
+    </w:p>
+    <w:sdt>
+      <w:sdtPr>
+        <w:rPr>
+          <w:lang w:val="es-ES"/>
+        </w:rPr>
+        <w:id w:val="191729094"/>
+        <w:docPartObj>
+          <w:docPartGallery w:val="Bibliographies"/>
+          <w:docPartUnique/>
+        </w:docPartObj>
+      </w:sdtPr>
+      <w:sdtEndPr>
+        <w:rPr>
+          <w:rFonts w:asciiTheme="minorHAnsi" w:eastAsiaTheme="minorHAnsi" w:hAnsiTheme="minorHAnsi" w:cstheme="minorBidi"/>
+          <w:color w:val="auto"/>
+          <w:sz w:val="22"/>
+          <w:szCs w:val="22"/>
+          <w:lang w:val="es-CO" w:eastAsia="en-US"/>
+        </w:rPr>
+      </w:sdtEndPr>
+      <w:sdtContent>
+        <w:p>
+          <w:pPr>
+            <w:pStyle w:val="Ttulo1"/>
+          </w:pPr>
+          <w:r>
+            <w:rPr>
+              <w:lang w:val="es-ES"/>
+            </w:rPr>
+            <w:t>Referencias</w:t>
+          </w:r>
+        </w:p>
+        <w:sdt>
+          <w:sdtPr>
+            <w:id w:val="-573587230"/>
+            <w:bibliography/>
+          </w:sdtPr>
+          <w:sdtContent>
+            <w:p>
+              <w:pPr>
+                <w:pStyle w:val="Bibliografa"/>
+                <w:ind w:left="720" w:hanging="720"/>
+                <w:rPr>
+                  <w:noProof/>
+                  <w:sz w:val="24"/>
+                  <w:szCs w:val="24"/>
+                  <w:lang w:val="es-ES"/>
+                </w:rPr>
+              </w:pPr>
+              <w:r>
+                <w:fldChar w:fldCharType="begin"/>
+              </w:r>
+              <w:r>
+                <w:rPr>
+                  <w:lang w:val="en-US"/>
+                </w:rPr>
+                <w:instrText>BIBLIOGRAPHY</w:instrText>
+              </w:r>
+              <w:r>
+                <w:fldChar w:fldCharType="separate"/>
+              </w:r>
+              <w:r>
+                <w:rPr>
+                  <w:noProof/>
+                  <w:lang w:val="en-US"/>
+                </w:rPr>
+                <w:t xml:space="preserve">Guru, R. (s.f.). </w:t>
+              </w:r>
+              <w:r>
+                <w:rPr>
+                  <w:i/>
+                  <w:iCs/>
+                  <w:noProof/>
+                  <w:lang w:val="en-US"/>
+                </w:rPr>
+                <w:t>Refactoring</w:t>
+              </w:r>
+              <w:r>
+                <w:rPr>
+                  <w:noProof/>
+                  <w:lang w:val="en-US"/>
+                </w:rPr>
+                <w:t xml:space="preserve">. </w:t>
+              </w:r>
+              <w:r>
+                <w:rPr>
+                  <w:noProof/>
+                  <w:lang w:val="es-ES"/>
+                </w:rPr>
+                <w:t>Obtenido de https://refactoring.guru/es/design-patterns/singleton</w:t>
+              </w:r>
+            </w:p>
+            <w:p>
+              <w:pPr>
+                <w:pStyle w:val="Bibliografa"/>
+                <w:ind w:left="720" w:hanging="720"/>
+                <w:rPr>
+                  <w:noProof/>
+                  <w:lang w:val="es-ES"/>
+                </w:rPr>
+              </w:pPr>
+              <w:r>
+                <w:rPr>
+                  <w:noProof/>
+                  <w:lang w:val="es-ES"/>
+                </w:rPr>
+                <w:t xml:space="preserve">patterns. (s.f.). </w:t>
+              </w:r>
+              <w:r>
+                <w:rPr>
+                  <w:i/>
+                  <w:iCs/>
+                  <w:noProof/>
+                  <w:lang w:val="es-ES"/>
+                </w:rPr>
+                <w:t>Patterns</w:t>
+              </w:r>
+              <w:r>
+                <w:rPr>
+                  <w:noProof/>
+                  <w:lang w:val="es-ES"/>
+                </w:rPr>
+                <w:t>. Obtenido de https://www.patterns.dev/vanilla/singleton-pattern/</w:t>
+              </w:r>
+            </w:p>
+            <w:p>
+              <w:pPr>
+                <w:pStyle w:val="Bibliografa"/>
+                <w:ind w:left="720" w:hanging="720"/>
+                <w:rPr>
+                  <w:noProof/>
+                  <w:lang w:val="es-ES"/>
+                </w:rPr>
+              </w:pPr>
+              <w:r>
+                <w:rPr>
+                  <w:noProof/>
+                  <w:lang w:val="es-ES"/>
+                </w:rPr>
+                <w:t xml:space="preserve">Zapata, M. (21 de 06 de 2023). </w:t>
+              </w:r>
+              <w:r>
+                <w:rPr>
+                  <w:i/>
+                  <w:iCs/>
+                  <w:noProof/>
+                  <w:lang w:val="es-ES"/>
+                </w:rPr>
+                <w:t>Platzi</w:t>
+              </w:r>
+              <w:r>
+                <w:rPr>
+                  <w:noProof/>
+                  <w:lang w:val="es-ES"/>
+                </w:rPr>
+                <w:t>. Obtenido de https://platzi.com/blog/arquitectura-hexagonal/</w:t>
+              </w:r>
+            </w:p>
+            <w:p>
+              <w:r>
+                <w:rPr>
+                  <w:b/>
+                  <w:bCs/>
+                </w:rPr>
+                <w:fldChar w:fldCharType="end"/>
+              </w:r>
+            </w:p>
+          </w:sdtContent>
+        </w:sdt>
+      </w:sdtContent>
+    </w:sdt>
+    <w:p>
+      <w:pPr>
+        <w:spacing w:after="0" w:line="360" w:lineRule="auto"/>
+        <w:rPr>
+          <w:rFonts w:ascii="Times New Roman" w:hAnsi="Times New Roman" w:cs="Times New Roman"/>
+          <w:noProof/>
+          <w:sz w:val="24"/>
+          <w:szCs w:val="24"/>
+        </w:rPr>
+      </w:pPr>
+    </w:p>
+    <w:p>
+      <w:pPr>
+        <w:spacing w:after="0" w:line="360" w:lineRule="auto"/>
+        <w:rPr>
+          <w:rFonts w:ascii="Times New Roman" w:hAnsi="Times New Roman" w:cs="Times New Roman"/>
+          <w:noProof/>
+          <w:sz w:val="24"/>
+          <w:szCs w:val="24"/>
+        </w:rPr>
+      </w:pPr>
+    </w:p>
+    <w:p>
+      <w:pPr>
+        <w:rPr>
+          <w:rFonts w:ascii="Times New Roman" w:hAnsi="Times New Roman" w:cs="Times New Roman"/>
+          <w:noProof/>
+          <w:sz w:val="24"/>
+          <w:szCs w:val="24"/>
+        </w:rPr>
+      </w:pPr>
+    </w:p>
+    <w:p>
+      <w:pPr>
+        <w:tabs>
+          <w:tab w:val="left" w:pos="3042"/>
+        </w:tabs>
+        <w:rPr>
+          <w:rFonts w:ascii="Times New Roman" w:hAnsi="Times New Roman" w:cs="Times New Roman"/>
+          <w:sz w:val="24"/>
+          <w:szCs w:val="24"/>
+        </w:rPr>
+      </w:pPr>
+      <w:r>
+        <w:rPr>
+          <w:rFonts w:ascii="Times New Roman" w:hAnsi="Times New Roman" w:cs="Times New Roman"/>
+          <w:sz w:val="24"/>
+          <w:szCs w:val="24"/>
+        </w:rPr>
+        <w:tab/>
+      </w:r>
     </w:p>
     <w:sectPr>
       <w:headerReference w:type="default" r:id="rId17"/>
@@ -7342,6 +7708,7 @@
   <w:style w:type="character" w:default="1" w:styleId="Fuentedeprrafopredeter">
     <w:name w:val="Default Paragraph Font"/>
     <w:uiPriority w:val="1"/>
+    <w:semiHidden/>
     <w:unhideWhenUsed/>
   </w:style>
   <w:style w:type="table" w:default="1" w:styleId="Tablanormal">
@@ -7916,91 +8283,66 @@
 <file path=customXml/item1.xml><?xml version="1.0" encoding="utf-8"?>
 <b:Sources xmlns:b="http://schemas.openxmlformats.org/officeDocument/2006/bibliography" xmlns="http://schemas.openxmlformats.org/officeDocument/2006/bibliography" SelectedStyle="\APASixthEditionOfficeOnline.xsl" StyleName="APA" Version="6">
   <b:Source>
-    <b:Tag>Mec21</b:Tag>
+    <b:Tag>pat</b:Tag>
     <b:SourceType>InternetSite</b:SourceType>
-    <b:Guid>{ED0AEFF7-2B5B-4434-9BE1-48B55728F766}</b:Guid>
+    <b:Guid>{8EEA0DB1-00D7-4932-AD2B-000CD6512E3C}</b:Guid>
     <b:Author>
       <b:Author>
         <b:NameList>
           <b:Person>
-            <b:Last>MecatrónicaLATAM</b:Last>
+            <b:Last>patterns</b:Last>
           </b:Person>
         </b:NameList>
       </b:Author>
     </b:Author>
-    <b:Title>Algebra Booleana</b:Title>
-    <b:Year>2021</b:Year>
-    <b:Month>Abril</b:Month>
-    <b:Day>22</b:Day>
-    <b:URL>https://www.mecatronicalatam.com/es/tutoriales/teoria/algebra-booleana/</b:URL>
+    <b:Title>Patterns</b:Title>
+    <b:URL>https://www.patterns.dev/vanilla/singleton-pattern/</b:URL>
     <b:RefOrder>1</b:RefOrder>
   </b:Source>
   <b:Source>
-    <b:Tag>Des15</b:Tag>
+    <b:Tag>Ref</b:Tag>
     <b:SourceType>InternetSite</b:SourceType>
-    <b:Guid>{02B9AAE1-1AE6-4C92-94DA-F9B0AFA15F1D}</b:Guid>
+    <b:Guid>{695F3A3B-A146-4060-A1B5-8B1D1087E164}</b:Guid>
     <b:Author>
       <b:Author>
         <b:NameList>
           <b:Person>
-            <b:Last>Desarrolloweb.com</b:Last>
+            <b:Last>Guru</b:Last>
+            <b:First>Refactoring</b:First>
           </b:Person>
         </b:NameList>
       </b:Author>
     </b:Author>
-    <b:Year>2015</b:Year>
-    <b:Month>Enero</b:Month>
-    <b:Day>16</b:Day>
-    <b:URL>https://desarrolloweb.com/articulos/tipos-datos-variables-entrada-salida.html</b:URL>
+    <b:Title>Refactoring</b:Title>
+    <b:URL>https://refactoring.guru/es/design-patterns/singleton</b:URL>
     <b:RefOrder>2</b:RefOrder>
   </b:Source>
   <b:Source>
-    <b:Tag>Hec20</b:Tag>
-    <b:SourceType>DocumentFromInternetSite</b:SourceType>
-    <b:Guid>{A1CEC989-4664-41C7-9523-C461576FA75F}</b:Guid>
-    <b:Title>SCRIBD - El Algebra Booleana</b:Title>
-    <b:Year>2020</b:Year>
-    <b:Month>Mayo</b:Month>
-    <b:URL>https://es.scribd.com/document/462315493/El-Algebra-Booleana</b:URL>
+    <b:Tag>Man23</b:Tag>
+    <b:SourceType>InternetSite</b:SourceType>
+    <b:Guid>{3AD4496E-E747-4CDA-AB0F-E32E1D8BB9A0}</b:Guid>
     <b:Author>
       <b:Author>
         <b:NameList>
           <b:Person>
-            <b:Last>Orozco</b:Last>
-            <b:First>Hector</b:First>
+            <b:Last>Zapata</b:Last>
+            <b:First>Manuel</b:First>
           </b:Person>
         </b:NameList>
       </b:Author>
     </b:Author>
+    <b:Title>Platzi</b:Title>
+    <b:Year>2023</b:Year>
+    <b:Month>06</b:Month>
+    <b:Day>21</b:Day>
+    <b:URL>https://platzi.com/blog/arquitectura-hexagonal/</b:URL>
     <b:RefOrder>3</b:RefOrder>
-  </b:Source>
-  <b:Source>
-    <b:Tag>Ant12</b:Tag>
-    <b:SourceType>InternetSite</b:SourceType>
-    <b:Guid>{B79AABB2-5C26-45FD-B7FD-05C858493CB5}</b:Guid>
-    <b:Title>Metodos de resolución de operaciones logicas booleanas</b:Title>
-    <b:Year>2012</b:Year>
-    <b:Month>Febrero</b:Month>
-    <b:Day>4</b:Day>
-    <b:URL>http://panamahitek.com/metodos-de-resolucion-de-operaciones-logicas-booleanas/</b:URL>
-    <b:Author>
-      <b:Author>
-        <b:NameList>
-          <b:Person>
-            <b:Last>Gonzalez</b:Last>
-            <b:First>Antony</b:First>
-            <b:Middle>Garcia</b:Middle>
-          </b:Person>
-        </b:NameList>
-      </b:Author>
-    </b:Author>
-    <b:RefOrder>4</b:RefOrder>
   </b:Source>
 </b:Sources>
 </file>
 
 <file path=customXml/itemProps1.xml><?xml version="1.0" encoding="utf-8"?>
-<ds:datastoreItem xmlns:ds="http://schemas.openxmlformats.org/officeDocument/2006/customXml" ds:itemID="{5C2CE457-01E8-4E5A-9AEA-23BE8013EF3F}">
+<ds:datastoreItem xmlns:ds="http://schemas.openxmlformats.org/officeDocument/2006/customXml" ds:itemID="{033B5A5D-C9F9-441F-B0D3-15AC2F30A55B}">
   <ds:schemaRefs>
     <ds:schemaRef ds:uri="http://schemas.openxmlformats.org/officeDocument/2006/bibliography"/>
   </ds:schemaRefs>

</xml_diff>